<commit_message>
testing pipe table headings
</commit_message>
<xml_diff>
--- a/_pages/modern.docx
+++ b/_pages/modern.docx
@@ -308,102 +308,295 @@
         <w:t xml:space="preserve">Rubric</w:t>
       </w:r>
     </w:p>
-    <w:p>
-      <w:pPr>
-        <w:pStyle w:val="BodyText"/>
-      </w:pPr>
-      <w:r>
-        <w:t xml:space="preserve">||</w:t>
-      </w:r>
-      <w:r>
-        <w:rPr>
-          <w:bCs/>
-          <w:b/>
-        </w:rPr>
-        <w:t xml:space="preserve">Exemplary (4.0)</w:t>
-      </w:r>
-      <w:r>
-        <w:t xml:space="preserve">|</w:t>
-      </w:r>
-      <w:r>
-        <w:rPr>
-          <w:bCs/>
-          <w:b/>
-        </w:rPr>
-        <w:t xml:space="preserve">Good (3.0)</w:t>
-      </w:r>
-      <w:r>
-        <w:t xml:space="preserve">|</w:t>
-      </w:r>
-      <w:r>
-        <w:rPr>
-          <w:bCs/>
-          <w:b/>
-        </w:rPr>
-        <w:t xml:space="preserve">Adequate (2.0)</w:t>
-      </w:r>
-      <w:r>
-        <w:t xml:space="preserve">|</w:t>
-      </w:r>
-      <w:r>
-        <w:rPr>
-          <w:bCs/>
-          <w:b/>
-        </w:rPr>
-        <w:t xml:space="preserve">Poor (1.0)</w:t>
-      </w:r>
-      <w:r>
-        <w:t xml:space="preserve">|</w:t>
-      </w:r>
-      <w:r>
-        <w:t xml:space="preserve"> </w:t>
-      </w:r>
-      <w:r>
-        <w:t xml:space="preserve">|</w:t>
-      </w:r>
-      <w:r>
-        <w:rPr>
-          <w:bCs/>
-          <w:b/>
-        </w:rPr>
-        <w:t xml:space="preserve">Readiness to Learn</w:t>
-      </w:r>
-      <w:r>
-        <w:t xml:space="preserve">|Student is always in class, having done all assignments, has relevant materials, and comes prepared with questions and ideas.|Student is always in class, having done all of the assignments, and has all of the relevant materials.|Student misses class, and/or has not done the work, or come prepared to discuss the topics of the day.|Student frequently misses class, and is regularly unprepared for the topics of the day.|</w:t>
-      </w:r>
-      <w:r>
-        <w:t xml:space="preserve"> </w:t>
-      </w:r>
-      <w:r>
-        <w:t xml:space="preserve">|</w:t>
-      </w:r>
-      <w:r>
-        <w:rPr>
-          <w:bCs/>
-          <w:b/>
-        </w:rPr>
-        <w:t xml:space="preserve">In-Class Contributions</w:t>
-      </w:r>
-      <w:r>
-        <w:t xml:space="preserve">|Student makes frequent constructive and insightful contributions to class conversations and group work.|Student’s contributions are infrequent, but constructive and insightful.|Student makes frequent contributions which are not constructive, or rarely contributes.|Student’s contributions actively diminish the learning environment (e.g., are off topic or attack others).|</w:t>
-      </w:r>
-      <w:r>
-        <w:t xml:space="preserve"> </w:t>
-      </w:r>
-      <w:r>
-        <w:t xml:space="preserve">|</w:t>
-      </w:r>
-      <w:r>
-        <w:rPr>
-          <w:bCs/>
-          <w:b/>
-        </w:rPr>
-        <w:t xml:space="preserve">Virtuous Participation</w:t>
-      </w:r>
-      <w:r>
-        <w:t xml:space="preserve">|Student regularly follows the code of intellectual conduct, and corrects themselves when failing to do so.| Student regularly follows the code of conduct, but does not recognize or improve upon unvirtuous behavior.|Student often violates the code of intellectual conduct and does not make serious efforts to improve.|Student frequently violates the code of intellectual conduct without making serious efforts to improve.|</w:t>
-      </w:r>
-    </w:p>
+    <w:tbl>
+      <w:tblPr>
+        <w:tblStyle w:val="Table"/>
+        <w:tblW w:type="pct" w:w="5000"/>
+        <w:tblLook w:firstRow="1" w:lastRow="0" w:firstColumn="0" w:lastColumn="0" w:noHBand="0" w:noVBand="0" w:val="0020"/>
+      </w:tblPr>
+      <w:tblGrid>
+        <w:gridCol w:w="1250"/>
+        <w:gridCol w:w="1667"/>
+        <w:gridCol w:w="1667"/>
+        <w:gridCol w:w="1667"/>
+        <w:gridCol w:w="1667"/>
+      </w:tblGrid>
+      <w:tr>
+        <w:trPr>
+          <w:tblHeader w:val="true"/>
+        </w:trPr>
+        <w:tc>
+          <w:tcPr/>
+          <w:p>
+            <w:pPr>
+              <w:pStyle w:val="Compact"/>
+            </w:pPr>
+          </w:p>
+        </w:tc>
+        <w:tc>
+          <w:tcPr/>
+          <w:p>
+            <w:pPr>
+              <w:pStyle w:val="Compact"/>
+              <w:jc w:val="left"/>
+            </w:pPr>
+            <w:r>
+              <w:rPr>
+                <w:bCs/>
+                <w:b/>
+              </w:rPr>
+              <w:t xml:space="preserve">Exemplary (4.0)</w:t>
+            </w:r>
+          </w:p>
+        </w:tc>
+        <w:tc>
+          <w:tcPr/>
+          <w:p>
+            <w:pPr>
+              <w:pStyle w:val="Compact"/>
+              <w:jc w:val="left"/>
+            </w:pPr>
+            <w:r>
+              <w:rPr>
+                <w:bCs/>
+                <w:b/>
+              </w:rPr>
+              <w:t xml:space="preserve">Good (3.0)</w:t>
+            </w:r>
+          </w:p>
+        </w:tc>
+        <w:tc>
+          <w:tcPr/>
+          <w:p>
+            <w:pPr>
+              <w:pStyle w:val="Compact"/>
+              <w:jc w:val="left"/>
+            </w:pPr>
+            <w:r>
+              <w:rPr>
+                <w:bCs/>
+                <w:b/>
+              </w:rPr>
+              <w:t xml:space="preserve">Adequate (2.0)</w:t>
+            </w:r>
+          </w:p>
+        </w:tc>
+        <w:tc>
+          <w:tcPr/>
+          <w:p>
+            <w:pPr>
+              <w:pStyle w:val="Compact"/>
+              <w:jc w:val="left"/>
+            </w:pPr>
+            <w:r>
+              <w:rPr>
+                <w:bCs/>
+                <w:b/>
+              </w:rPr>
+              <w:t xml:space="preserve">Poor (1.0)</w:t>
+            </w:r>
+          </w:p>
+        </w:tc>
+      </w:tr>
+      <w:tr>
+        <w:tc>
+          <w:tcPr/>
+          <w:p>
+            <w:pPr>
+              <w:pStyle w:val="Compact"/>
+              <w:jc w:val="left"/>
+            </w:pPr>
+            <w:r>
+              <w:rPr>
+                <w:bCs/>
+                <w:b/>
+              </w:rPr>
+              <w:t xml:space="preserve">Readiness to Learn</w:t>
+            </w:r>
+          </w:p>
+        </w:tc>
+        <w:tc>
+          <w:tcPr/>
+          <w:p>
+            <w:pPr>
+              <w:pStyle w:val="Compact"/>
+              <w:jc w:val="left"/>
+            </w:pPr>
+            <w:r>
+              <w:t xml:space="preserve">Student is always in class, having done all assignments, has relevant materials, and comes prepared with questions and ideas.</w:t>
+            </w:r>
+          </w:p>
+        </w:tc>
+        <w:tc>
+          <w:tcPr/>
+          <w:p>
+            <w:pPr>
+              <w:pStyle w:val="Compact"/>
+              <w:jc w:val="left"/>
+            </w:pPr>
+            <w:r>
+              <w:t xml:space="preserve">Student is always in class, having done all of the assignments, and has all of the relevant materials.</w:t>
+            </w:r>
+          </w:p>
+        </w:tc>
+        <w:tc>
+          <w:tcPr/>
+          <w:p>
+            <w:pPr>
+              <w:pStyle w:val="Compact"/>
+              <w:jc w:val="left"/>
+            </w:pPr>
+            <w:r>
+              <w:t xml:space="preserve">Student misses class, and/or has not done the work, or come prepared to discuss the topics of the day.</w:t>
+            </w:r>
+          </w:p>
+        </w:tc>
+        <w:tc>
+          <w:tcPr/>
+          <w:p>
+            <w:pPr>
+              <w:pStyle w:val="Compact"/>
+              <w:jc w:val="left"/>
+            </w:pPr>
+            <w:r>
+              <w:t xml:space="preserve">Student frequently misses class, and is regularly unprepared for the topics of the day.</w:t>
+            </w:r>
+          </w:p>
+        </w:tc>
+      </w:tr>
+      <w:tr>
+        <w:tc>
+          <w:tcPr/>
+          <w:p>
+            <w:pPr>
+              <w:pStyle w:val="Compact"/>
+              <w:jc w:val="left"/>
+            </w:pPr>
+            <w:r>
+              <w:rPr>
+                <w:bCs/>
+                <w:b/>
+              </w:rPr>
+              <w:t xml:space="preserve">In-Class Contributions</w:t>
+            </w:r>
+          </w:p>
+        </w:tc>
+        <w:tc>
+          <w:tcPr/>
+          <w:p>
+            <w:pPr>
+              <w:pStyle w:val="Compact"/>
+              <w:jc w:val="left"/>
+            </w:pPr>
+            <w:r>
+              <w:t xml:space="preserve">Student makes frequent constructive and insightful contributions to class conversations and group work.</w:t>
+            </w:r>
+          </w:p>
+        </w:tc>
+        <w:tc>
+          <w:tcPr/>
+          <w:p>
+            <w:pPr>
+              <w:pStyle w:val="Compact"/>
+              <w:jc w:val="left"/>
+            </w:pPr>
+            <w:r>
+              <w:t xml:space="preserve">Student’s contributions are infrequent, but constructive and insightful.</w:t>
+            </w:r>
+          </w:p>
+        </w:tc>
+        <w:tc>
+          <w:tcPr/>
+          <w:p>
+            <w:pPr>
+              <w:pStyle w:val="Compact"/>
+              <w:jc w:val="left"/>
+            </w:pPr>
+            <w:r>
+              <w:t xml:space="preserve">Student makes frequent contributions which are not constructive, or rarely contributes.</w:t>
+            </w:r>
+          </w:p>
+        </w:tc>
+        <w:tc>
+          <w:tcPr/>
+          <w:p>
+            <w:pPr>
+              <w:pStyle w:val="Compact"/>
+              <w:jc w:val="left"/>
+            </w:pPr>
+            <w:r>
+              <w:t xml:space="preserve">Student’s contributions actively diminish the learning environment (e.g., are off topic or attack others).</w:t>
+            </w:r>
+          </w:p>
+        </w:tc>
+      </w:tr>
+      <w:tr>
+        <w:tc>
+          <w:tcPr/>
+          <w:p>
+            <w:pPr>
+              <w:pStyle w:val="Compact"/>
+              <w:jc w:val="left"/>
+            </w:pPr>
+            <w:r>
+              <w:rPr>
+                <w:bCs/>
+                <w:b/>
+              </w:rPr>
+              <w:t xml:space="preserve">Virtuous Participation</w:t>
+            </w:r>
+          </w:p>
+        </w:tc>
+        <w:tc>
+          <w:tcPr/>
+          <w:p>
+            <w:pPr>
+              <w:pStyle w:val="Compact"/>
+              <w:jc w:val="left"/>
+            </w:pPr>
+            <w:r>
+              <w:t xml:space="preserve">Student regularly follows the code of intellectual conduct, and corrects themselves when failing to do so.</w:t>
+            </w:r>
+          </w:p>
+        </w:tc>
+        <w:tc>
+          <w:tcPr/>
+          <w:p>
+            <w:pPr>
+              <w:pStyle w:val="Compact"/>
+              <w:jc w:val="left"/>
+            </w:pPr>
+            <w:r>
+              <w:t xml:space="preserve">Student regularly follows the code of conduct, but does not recognize or improve upon unvirtuous behavior.</w:t>
+            </w:r>
+          </w:p>
+        </w:tc>
+        <w:tc>
+          <w:tcPr/>
+          <w:p>
+            <w:pPr>
+              <w:pStyle w:val="Compact"/>
+              <w:jc w:val="left"/>
+            </w:pPr>
+            <w:r>
+              <w:t xml:space="preserve">Student often violates the code of intellectual conduct and does not make serious efforts to improve.</w:t>
+            </w:r>
+          </w:p>
+        </w:tc>
+        <w:tc>
+          <w:tcPr/>
+          <w:p>
+            <w:pPr>
+              <w:pStyle w:val="Compact"/>
+              <w:jc w:val="left"/>
+            </w:pPr>
+            <w:r>
+              <w:t xml:space="preserve">Student frequently violates the code of intellectual conduct without making serious efforts to improve.</w:t>
+            </w:r>
+          </w:p>
+        </w:tc>
+      </w:tr>
+    </w:tbl>
     <w:p>
       <w:pPr>
         <w:pStyle w:val="BodyText"/>
@@ -517,7 +710,7 @@
         <w:pStyle w:val="FirstParagraph"/>
       </w:pPr>
       <w:r>
-        <w:t xml:space="preserve">At three points in the semester, I will ask you to schedule a meeting with me to discuss the views of one of the philosophers we have focused on. I’ll ask you to begin the conversation by doing two things:</w:t>
+        <w:t xml:space="preserve">At three points in the semester, I will ask you to schedule a meeting with me to discuss the views of one of the philosophers we have focused on. I’ll ask you to begin the conversation by doing two things (in about 5 minutes):</w:t>
       </w:r>
       <w:r>
         <w:t xml:space="preserve"> </w:t>
@@ -695,7 +888,7 @@
         <w:pStyle w:val="FirstParagraph"/>
       </w:pPr>
       <w:r>
-        <w:t xml:space="preserve">In this paper, you will enter into the philosophical discussion begun and carried through the Modern period. The central aims of the assignment are for you to practice philosophical argumentation, clear writing, and the practice of dialogue through your writing. To engage in that dialogue, we (and I am part of it too!) will write this paper in three parts:</w:t>
+        <w:t xml:space="preserve">In this paper, you will enter into the philosophical discussion begun and carried through the Modern period. The central aims of the assignment are for you to practice philosophical argumentation, clear writing, and the practice of dialogue through your writing. To engage in that dialogue, we (and I am part of it too!) will write this paper in four parts:</w:t>
       </w:r>
     </w:p>
     <w:p>
@@ -710,13 +903,34 @@
           <w:iCs/>
           <w:i/>
         </w:rPr>
+        <w:t xml:space="preserve">Project Proposal</w:t>
+      </w:r>
+      <w:r>
+        <w:t xml:space="preserve"> </w:t>
+      </w:r>
+      <w:r>
+        <w:t xml:space="preserve">- the first step is to provide me with a short 1-2 page summary of (a) what philosophical question you want to write about, (b) what texts you want to use to help you answer it, and (c) why you picked those sources. You do not need to have your arguments worked out at this point. Instead, the purpose of this assignment is to help you start thinking about the project early, and for me to help you avoid any potential dead-ends or pitfalls.</w:t>
+      </w:r>
+    </w:p>
+    <w:p>
+      <w:pPr>
+        <w:numPr>
+          <w:ilvl w:val="0"/>
+          <w:numId w:val="1004"/>
+        </w:numPr>
+      </w:pPr>
+      <w:r>
+        <w:rPr>
+          <w:iCs/>
+          <w:i/>
+        </w:rPr>
         <w:t xml:space="preserve">Argument Paper</w:t>
       </w:r>
       <w:r>
         <w:t xml:space="preserve"> </w:t>
       </w:r>
       <w:r>
-        <w:t xml:space="preserve">– the first step is a traditional argumentative paper. In this paper, you will take up a question asked by one of the philosophers we read this semester, and argue for a position on that question. To do so, you should (a) motivate the question - explain</w:t>
+        <w:t xml:space="preserve">– the next step is a traditional argumentative paper. In this paper, you will take up a question asked by one of the philosophers we read this semester, and argue for a position on that question. To do so, you should (a) motivate the question - explain</w:t>
       </w:r>
       <w:r>
         <w:t xml:space="preserve"> </w:t>
@@ -1060,7 +1274,7 @@
       </w:hyperlink>
     </w:p>
     <w:bookmarkEnd w:id="32"/>
-    <w:bookmarkStart w:id="38" w:name="course-policies"/>
+    <w:bookmarkStart w:id="35" w:name="course-policies"/>
     <w:p>
       <w:pPr>
         <w:pStyle w:val="Heading2"/>
@@ -1069,914 +1283,1088 @@
         <w:t xml:space="preserve">Course Policies</w:t>
       </w:r>
     </w:p>
-    <w:bookmarkStart w:id="33" w:name="respect-for-your-classmates"/>
-    <w:p>
-      <w:pPr>
-        <w:pStyle w:val="Heading3"/>
-      </w:pPr>
-      <w:r>
+    <w:p>
+      <w:pPr>
+        <w:pStyle w:val="FirstParagraph"/>
+      </w:pPr>
+      <w:r>
+        <w:rPr>
+          <w:bCs/>
+          <w:b/>
+        </w:rPr>
+        <w:t xml:space="preserve">Well-Being Policy</w:t>
+      </w:r>
+    </w:p>
+    <w:p>
+      <w:pPr>
+        <w:pStyle w:val="BodyText"/>
+      </w:pPr>
+      <w:r>
+        <w:t xml:space="preserve">Here are two reasons I care about your well-being. First, a student who feels safe, welcome, and healthy, is a more successful student. If you are well, you’ll learn more. Second, and more importantly, your college experience, including this class, should contribute to a well-lived life. The information we cover, and the skills we practice, are in service to that well-lived life.</w:t>
+      </w:r>
+    </w:p>
+    <w:p>
+      <w:pPr>
+        <w:pStyle w:val="BodyText"/>
+      </w:pPr>
+      <w:r>
+        <w:t xml:space="preserve">In practice, this means that if you are struggling in any way - academically, personally, whatever, please feel encouraged to set up a meeting or stop by my office to chat. I am always willing to listen, and where I can, help.</w:t>
+      </w:r>
+    </w:p>
+    <w:p>
+      <w:pPr>
+        <w:pStyle w:val="BodyText"/>
+      </w:pPr>
+      <w:r>
+        <w:t xml:space="preserve">St. Lawrence also has a host of resources available to you with your intellectual, physical, and emotional wellness. You can find a handy guide to all of these resoruces on the</w:t>
+      </w:r>
+      <w:r>
+        <w:t xml:space="preserve"> </w:t>
+      </w:r>
+      <w:hyperlink r:id="rId33">
+        <w:r>
+          <w:rPr>
+            <w:rStyle w:val="Hyperlink"/>
+          </w:rPr>
+          <w:t xml:space="preserve">Well-Being Resources</w:t>
+        </w:r>
+      </w:hyperlink>
+      <w:r>
+        <w:t xml:space="preserve"> </w:t>
+      </w:r>
+      <w:r>
+        <w:t xml:space="preserve">page, and through</w:t>
+      </w:r>
+      <w:r>
+        <w:t xml:space="preserve"> </w:t>
+      </w:r>
+      <w:hyperlink r:id="rId34">
+        <w:r>
+          <w:rPr>
+            <w:rStyle w:val="Hyperlink"/>
+          </w:rPr>
+          <w:t xml:space="preserve">SLU Thrives</w:t>
+        </w:r>
+      </w:hyperlink>
+      <w:r>
+        <w:t xml:space="preserve">.</w:t>
+      </w:r>
+    </w:p>
+    <w:p>
+      <w:pPr>
+        <w:pStyle w:val="BodyText"/>
+      </w:pPr>
+      <w:r>
+        <w:rPr>
+          <w:bCs/>
+          <w:b/>
+        </w:rPr>
         <w:t xml:space="preserve">Respect for your classmates</w:t>
       </w:r>
     </w:p>
     <w:p>
       <w:pPr>
+        <w:pStyle w:val="BodyText"/>
+      </w:pPr>
+      <w:r>
+        <w:t xml:space="preserve">We are a community, and every one of us is a part of it. Contributing to a healthy community is important, both because it affirms that each of us belongs and has a place here at St. Lawrence and in Philosophy courses, but also because we all learn better when we feel we can trust each other. We can trust each other to listen and think carefully about what we say. We can trust each other to value us as people, and to respect our dignity. We can trust each other to challenge us, but to do so with humility, recognizing that we all get things wrong.</w:t>
+      </w:r>
+    </w:p>
+    <w:p>
+      <w:pPr>
+        <w:pStyle w:val="BodyText"/>
+      </w:pPr>
+      <w:r>
+        <w:t xml:space="preserve">As part of upholding this community, I expect that you will:</w:t>
+      </w:r>
+      <w:r>
+        <w:t xml:space="preserve"> </w:t>
+      </w:r>
+      <w:r>
+        <w:t xml:space="preserve">* Listen attentively while your classmates, or me, are talking.</w:t>
+      </w:r>
+      <w:r>
+        <w:t xml:space="preserve"> </w:t>
+      </w:r>
+      <w:r>
+        <w:t xml:space="preserve">* Arrive to class on time</w:t>
+      </w:r>
+      <w:r>
+        <w:t xml:space="preserve"> </w:t>
+      </w:r>
+      <w:r>
+        <w:t xml:space="preserve">* Show respect for your classmates, and avoid making disrespectful comments about their contributions, or showing clearly disrespectful body language in response to them.</w:t>
+      </w:r>
+      <w:r>
+        <w:t xml:space="preserve"> </w:t>
+      </w:r>
+      <w:r>
+        <w:t xml:space="preserve">* Be welcoming of your classmates ideas and contributions, and avoid making aggressive comments targeting your classmates or any group of people.</w:t>
+      </w:r>
+    </w:p>
+    <w:p>
+      <w:pPr>
+        <w:pStyle w:val="BodyText"/>
+      </w:pPr>
+      <w:r>
+        <w:rPr>
+          <w:bCs/>
+          <w:b/>
+        </w:rPr>
+        <w:t xml:space="preserve">Late Assignment Policy</w:t>
+      </w:r>
+    </w:p>
+    <w:p>
+      <w:pPr>
+        <w:pStyle w:val="BodyText"/>
+      </w:pPr>
+      <w:r>
+        <w:t xml:space="preserve">Here’s how I think about due dates: they are there for you. What does that mean? Well, one thing due dates help you do is structure your work, so that you are not hit with too many obligations at the same time. Another is that they help you learn how to work under a deadline, an experience you will have throughout your time at SLU and in your working life. Due dates also help make sure you are prepared for class. My policies on due dates are based on these goals.</w:t>
+      </w:r>
+    </w:p>
+    <w:p>
+      <w:pPr>
+        <w:pStyle w:val="BodyText"/>
+      </w:pPr>
+      <w:r>
+        <w:t xml:space="preserve">Daily quizzes cannot be made up or submitted late, because their purpose is to help you prepare for and engage in that day’s class discussions. Recognizing, however, that things happen and you may need to miss class or might be less prepared than you would have liked to be, I will be dropping the two lowest quiz grades.</w:t>
+      </w:r>
+    </w:p>
+    <w:p>
+      <w:pPr>
+        <w:pStyle w:val="BodyText"/>
+      </w:pPr>
+      <w:r>
+        <w:t xml:space="preserve">For the paper, you may need flexiblity. It’s a big project and conflicts with other responsibilities may get in the way. Part of learning how to work under deadlines is planning ahead in a professionally responsible way to get more time. I am willing to grant extensions if you plan ahead and ask for one (at least 24 hours before the paper is due), but will refuse to grant an extension if you regularly ask for one (asking for more time in a professionally responsible way is perfectly reasonable, but developing a habit of needing it is not). When you ask for an extension, please specify how much extra time you will need. Please note that I will be less flexible with extra time on the argument paper, because your classmate writing a reply to you will need time to do that work.</w:t>
+      </w:r>
+    </w:p>
+    <w:p>
+      <w:pPr>
+        <w:pStyle w:val="BodyText"/>
+      </w:pPr>
+      <w:r>
+        <w:rPr>
+          <w:bCs/>
+          <w:b/>
+        </w:rPr>
+        <w:t xml:space="preserve">Academic Honesty and AI Use</w:t>
+      </w:r>
+    </w:p>
+    <w:p>
+      <w:pPr>
+        <w:pStyle w:val="BodyText"/>
+      </w:pPr>
+      <w:r>
+        <w:t xml:space="preserve">A major commitment of the University is</w:t>
+      </w:r>
+      <w:r>
+        <w:t xml:space="preserve"> </w:t>
+      </w:r>
+      <w:r>
+        <w:t xml:space="preserve">“</w:t>
+      </w:r>
+      <w:r>
+        <w:t xml:space="preserve">to the intellectual development of the student</w:t>
+      </w:r>
+      <w:r>
+        <w:t xml:space="preserve">”</w:t>
+      </w:r>
+      <w:r>
+        <w:t xml:space="preserve"> </w:t>
+      </w:r>
+      <w:r>
+        <w:t xml:space="preserve">(St. Lawrence University Aims and Objectives) which can be achieved only by strict adherence to standards of honesty. At St. Lawrence, all members of the community have a responsibility to see that these standards are maintained. Consequently, St. Lawrence University students will not engage in acts of academic dishonesty as described in the Academic Honor Code, contained in the Student Handbook.</w:t>
+      </w:r>
+    </w:p>
+    <w:p>
+      <w:pPr>
+        <w:pStyle w:val="BodyText"/>
+      </w:pPr>
+      <w:r>
+        <w:t xml:space="preserve">As part of this policy, you may not use Generative AI tools (like ChatGPT or Google NotebookLM), except tools designed solely for grammatical improvement on text you have already written (such as Grammarly). However, you may not provide text into Generative AI tools like ChatGPT and ask it to rewrite or otherwise fix your text. Similarly, you cannot use Grammarly’s advanced functions (such as those in the Pro version) that suggest and apply rewrites to your text. The difference is this: tools like Grammarly that provide local suggestions to fix particular pieces of writing, and which you can then decide to accept or not, still require you to make decisions about the appropriateness of particular changes, and to see why the change is suggested. Asking a LLM to fix or improve a block of text instead encourages you to trust a more extensive rewriting without understanding why it was rewritten in the way it was, or whether that rewrite improved your essay. Further, these tools often cause problems for philosophical thinking, since they attempt to bring your sentences in line with common ways of speaking which can introduce ambiguities in a precise style of writing like philosophy. You may not always know if your use of a grammatical tool counts as</w:t>
+      </w:r>
+      <w:r>
+        <w:t xml:space="preserve"> </w:t>
+      </w:r>
+      <w:r>
+        <w:t xml:space="preserve">‘</w:t>
+      </w:r>
+      <w:r>
+        <w:t xml:space="preserve">rewriting</w:t>
+      </w:r>
+      <w:r>
+        <w:t xml:space="preserve">’</w:t>
+      </w:r>
+      <w:r>
+        <w:t xml:space="preserve"> </w:t>
+      </w:r>
+      <w:r>
+        <w:t xml:space="preserve">or not - please remember you can</w:t>
+      </w:r>
+      <w:r>
+        <w:t xml:space="preserve"> </w:t>
+      </w:r>
+      <w:r>
+        <w:rPr>
+          <w:iCs/>
+          <w:i/>
+        </w:rPr>
+        <w:t xml:space="preserve">always ask me</w:t>
+      </w:r>
+      <w:r>
+        <w:t xml:space="preserve">!</w:t>
+      </w:r>
+    </w:p>
+    <w:p>
+      <w:pPr>
+        <w:pStyle w:val="BodyText"/>
+      </w:pPr>
+      <w:r>
+        <w:t xml:space="preserve">You may not use Generative AI to write text, summarize ideas, generate or brainstorm your own thesis or arguments, or outline your paper. The reason for this policy is that these are all foundational skills this class is designed to help you improve. Using AI effectively to do these tasks requires that you are able to do them as well, otherwise you will be unprepared to evaluate what the AI generates. You may or may not engage with AI in your writing processes outside of this class and outside of your time at St. Lawrence. This course will help you build the foundational skills to use these tools critically, and to evaluate how others use them.</w:t>
+      </w:r>
+    </w:p>
+    <w:p>
+      <w:pPr>
+        <w:pStyle w:val="BodyText"/>
+      </w:pPr>
+      <w:r>
+        <w:rPr>
+          <w:bCs/>
+          <w:b/>
+        </w:rPr>
+        <w:t xml:space="preserve">Accessibility</w:t>
+      </w:r>
+    </w:p>
+    <w:p>
+      <w:pPr>
+        <w:pStyle w:val="BodyText"/>
+      </w:pPr>
+      <w:r>
+        <w:t xml:space="preserve">It is the policy and practice of St. Lawrence University to create inclusive and accessible learning environments consistent with federal and state law. If you have established permanent accommodations with the Student Accessibility Services (SAS) Office in the past and want to use them in your current courses, please activate your accommodations so you can discuss with your professors how they will be implemented.</w:t>
+      </w:r>
+    </w:p>
+    <w:p>
+      <w:pPr>
+        <w:pStyle w:val="BodyText"/>
+      </w:pPr>
+      <w:r>
+        <w:t xml:space="preserve">If you do not yet have services through the SAS Office but have a disability or temporary health condition that requires accommodations, please contact them directly to start the process of requesting accommodations and to receive guidance with the next steps.</w:t>
+      </w:r>
+    </w:p>
+    <w:p>
+      <w:pPr>
+        <w:pStyle w:val="BodyText"/>
+      </w:pPr>
+      <w:r>
+        <w:t xml:space="preserve">Contact information for Student Accessibility Services:</w:t>
+      </w:r>
+      <w:r>
+        <w:t xml:space="preserve"> </w:t>
+      </w:r>
+      <w:r>
+        <w:t xml:space="preserve">Telephone: 315.229.5537</w:t>
+      </w:r>
+      <w:r>
+        <w:t xml:space="preserve"> </w:t>
+      </w:r>
+      <w:r>
+        <w:t xml:space="preserve">Email: studentaccessibility@stlawu.edu</w:t>
+      </w:r>
+      <w:r>
+        <w:br/>
+      </w:r>
+      <w:r>
+        <w:t xml:space="preserve">Website: https://www.stlawu.edu/offices/student-accessibility-services</w:t>
+      </w:r>
+    </w:p>
+    <w:p>
+      <w:pPr>
+        <w:pStyle w:val="BodyText"/>
+      </w:pPr>
+      <w:r>
+        <w:rPr>
+          <w:bCs/>
+          <w:b/>
+        </w:rPr>
+        <w:t xml:space="preserve">Title IX Statement</w:t>
+      </w:r>
+    </w:p>
+    <w:p>
+      <w:pPr>
+        <w:pStyle w:val="BodyText"/>
+      </w:pPr>
+      <w:r>
+        <w:t xml:space="preserve">MEMBERS OF THE ST. LAWRENCE COMMUNITY—students, employees, and guests— should expect to be free from retaliation, discrimination, harassment, and sexual misconduct, behavior that is inherently abusive of the humanity that each of us brings to the campus community. St. Lawrence University and its faculty are committed to supporting our students and seeking an environment that is free of discrimination, harassment, and sexual misconduct. St. Lawrence strongly encourages students to report retaliation, discrimination, harassment, including sexual harassment, sexual exploitation, domestic violence, dating violence, stalking, or sexual assault to St. Lawrence University’s Title IX office. Discrimination on the basis of sex includes discrimination on the basis of assigned sex at birth, sex characteristics, pregnancy and pregnancy related conditions, sexual orientation, and gender identity.</w:t>
+      </w:r>
+    </w:p>
+    <w:p>
+      <w:pPr>
+        <w:pStyle w:val="BodyText"/>
+      </w:pPr>
+      <w:r>
+        <w:t xml:space="preserve">If you speak with a faculty member about an incident that involves a Title IX matter or matter of other discrimination or harassment, that faculty member must notify SLU’s Title IX Coordinator that you shared that experience. This is true even if you ask the faculty member not to disclose the incident. Moreover, if you disclose an incident of retaliation, discrimination, harassment, or sexual misconduct in an academic assignment, the faculty member must also report that experience to the Title IX Coordinator.</w:t>
+      </w:r>
+    </w:p>
+    <w:p>
+      <w:pPr>
+        <w:pStyle w:val="BodyText"/>
+      </w:pPr>
+      <w:r>
+        <w:t xml:space="preserve">Once a report is made, the reporting individual can expect to receive email outreach from the Title IX Coordinator, who will provide resources and possible resolution options. If the impacted person is not a threat to themselves or others, the impacted person will be free not to respond to the offer to meet. You can find more information for resources and reporting options at: https://www.stlawu.edu/offices/title-ix/reporting-options-confidential-and-nonconfidential-resources.</w:t>
+      </w:r>
+    </w:p>
+    <w:p>
+      <w:pPr>
+        <w:pStyle w:val="BodyText"/>
+      </w:pPr>
+      <w:r>
+        <w:t xml:space="preserve">Title IX also protects students who are pregnant or need assistance for pregnancy related conditions. If you are pregnant, the Title IX Coordinator can assist you in understanding your rights and options as well as provide supportive measures.</w:t>
+      </w:r>
+      <w:r>
+        <w:t xml:space="preserve"> </w:t>
+      </w:r>
+      <w:r>
+        <w:t xml:space="preserve">Lindsey Tropper (Cohen) is the Title IX Coordinator at St. Lawrence University (Student Center Room 302; lcohen@stlawu.edu; 315-229-5334).</w:t>
+      </w:r>
+    </w:p>
+    <w:bookmarkEnd w:id="35"/>
+    <w:bookmarkStart w:id="36" w:name="calendar"/>
+    <w:p>
+      <w:pPr>
+        <w:pStyle w:val="Heading2"/>
+      </w:pPr>
+      <w:r>
+        <w:t xml:space="preserve">Calendar</w:t>
+      </w:r>
+    </w:p>
+    <w:p>
+      <w:pPr>
         <w:pStyle w:val="FirstParagraph"/>
       </w:pPr>
       <w:r>
-        <w:t xml:space="preserve">We are a community, and every one of us is a part of it. Contributing to a healthy community is important, both because it affirms that each of us belongs and has a place here at St. Lawrence and in Philosophy courses, but also because we all learn better when we feel we can trust each other. We can trust each other to listen and think carefully about what we say. We can trust each other to value us as people, and to respect our dignity. We can trust each other to challenge us, but to do so with humility, recognizing that we all get things wrong.</w:t>
-      </w:r>
-    </w:p>
-    <w:p>
-      <w:pPr>
-        <w:pStyle w:val="BodyText"/>
-      </w:pPr>
-      <w:r>
-        <w:t xml:space="preserve">As part of upholding this community, I expect that you will:</w:t>
-      </w:r>
-      <w:r>
-        <w:t xml:space="preserve"> </w:t>
-      </w:r>
-      <w:r>
-        <w:t xml:space="preserve">* Listen attentively while your classmates, or me, are talking.</w:t>
-      </w:r>
-      <w:r>
-        <w:t xml:space="preserve"> </w:t>
-      </w:r>
-      <w:r>
-        <w:t xml:space="preserve">* Arrive to class on time</w:t>
-      </w:r>
-      <w:r>
-        <w:t xml:space="preserve"> </w:t>
-      </w:r>
-      <w:r>
-        <w:t xml:space="preserve">* Show respect for your classmates, and avoid making disrespectful comments about their contributions, or showing clearly disrespectful body language in response to them.</w:t>
-      </w:r>
-      <w:r>
-        <w:t xml:space="preserve"> </w:t>
-      </w:r>
-      <w:r>
-        <w:t xml:space="preserve">* Be welcoming of your classmates ideas and contributions, and avoid making aggressive comments targeting your classmates or any group of people.</w:t>
-      </w:r>
-    </w:p>
-    <w:bookmarkEnd w:id="33"/>
-    <w:bookmarkStart w:id="34" w:name="late-assignment-policy"/>
-    <w:p>
-      <w:pPr>
-        <w:pStyle w:val="Heading3"/>
-      </w:pPr>
-      <w:r>
-        <w:t xml:space="preserve">Late Assignment Policy</w:t>
-      </w:r>
-    </w:p>
-    <w:p>
-      <w:pPr>
-        <w:pStyle w:val="FirstParagraph"/>
-      </w:pPr>
-      <w:r>
-        <w:t xml:space="preserve">Here’s how I think about due dates: they are there for you. What does that mean? Well, one thing due dates help you do is structure your work, so that you are not hit with too many obligations at the same time. Another is that they help you learn how to work under a deadline, an experience you will have throughout your time at SLU and in your working life. Due dates also help make sure you are prepared for class. My policies on due dates are based on these goals.</w:t>
-      </w:r>
-    </w:p>
-    <w:p>
-      <w:pPr>
-        <w:pStyle w:val="BodyText"/>
-      </w:pPr>
-      <w:r>
-        <w:t xml:space="preserve">Daily quizzes cannot be made up or submitted late, because their purpose is to help you prepare for and engage in that day’s class discussions. Recognizing, however, that things happen and you may need to miss class or might be less prepared than you would have liked to be, I will be dropping the two lowest quiz grades.</w:t>
-      </w:r>
-    </w:p>
-    <w:p>
-      <w:pPr>
-        <w:pStyle w:val="BodyText"/>
-      </w:pPr>
-      <w:r>
-        <w:t xml:space="preserve">For the paper, you may need flexiblity. It’s a big project and conflicts with other responsibilities may get in the way. Part of learning how to work under deadlines is planning ahead in a professionally responsible way to get more time. I am willing to grant extensions if you plan ahead and ask for one (at least 24 hours before the paper is due), but will refuse to grant an extension if you regularly ask for one (asking for more time in a professionally responsible way is perfectly reasonable, but developing a habit of needing it is not). When you ask for an extension, please specify how much extra time you will need. Please note that I will be less flexible with extra time on the argument paper, because your classmate writing a reply to you will need time to do that work.</w:t>
-      </w:r>
-    </w:p>
-    <w:bookmarkEnd w:id="34"/>
-    <w:bookmarkStart w:id="35" w:name="academic-honesty-and-ai-use"/>
-    <w:p>
-      <w:pPr>
-        <w:pStyle w:val="Heading3"/>
-      </w:pPr>
-      <w:r>
-        <w:t xml:space="preserve">Academic Honesty and AI Use</w:t>
-      </w:r>
-    </w:p>
-    <w:p>
-      <w:pPr>
-        <w:pStyle w:val="FirstParagraph"/>
-      </w:pPr>
-      <w:r>
-        <w:t xml:space="preserve">A major commitment of the University is</w:t>
-      </w:r>
-      <w:r>
-        <w:t xml:space="preserve"> </w:t>
-      </w:r>
-      <w:r>
-        <w:t xml:space="preserve">“</w:t>
-      </w:r>
-      <w:r>
-        <w:t xml:space="preserve">to the intellectual development of the student</w:t>
-      </w:r>
-      <w:r>
-        <w:t xml:space="preserve">”</w:t>
-      </w:r>
-      <w:r>
-        <w:t xml:space="preserve"> </w:t>
-      </w:r>
-      <w:r>
-        <w:t xml:space="preserve">(St. Lawrence University Aims and Objectives) which can be achieved only by strict adherence to standards of honesty. At St. Lawrence, all members of the community have a responsibility to see that these standards are maintained. Consequently, St. Lawrence University students will not engage in acts of academic dishonesty as described in the Academic Honor Code, contained in the Student Handbook.</w:t>
-      </w:r>
-    </w:p>
-    <w:p>
-      <w:pPr>
-        <w:pStyle w:val="BodyText"/>
-      </w:pPr>
-      <w:r>
-        <w:t xml:space="preserve">As part of this policy, you may not use Generative AI tools (like ChatGPT or Google NotebookLM), except tools designed solely for grammatical improvement on text you have already written (such as Grammarly). However, you may not provide text into Generative AI tools like ChatGPT and ask it to rewrite or otherwise fix your text. Similarly, you cannot use Grammarly’s advanced functions (such as those in the Pro version) that suggest and apply rewrites to your text. The difference is this: tools like Grammarly that provide local suggestions to fix particular pieces of writing, and which you can then decide to accept or not, still require you to make decisions about the appropriateness of particular changes, and to see why the change is suggested. Asking a LLM to fix or improve a block of text instead encourages you to trust a more extensive rewriting without understanding why it was rewritten in the way it was, or whether that rewrite improved your essay. Further, these tools often cause problems for philosophical thinking, since they attempt to bring your sentences in line with common ways of speaking which can introduce ambiguities in a precise style of writing like philosophy. You may not always know if your use of a grammatical tool counts as</w:t>
-      </w:r>
-      <w:r>
-        <w:t xml:space="preserve"> </w:t>
-      </w:r>
-      <w:r>
-        <w:t xml:space="preserve">‘</w:t>
-      </w:r>
-      <w:r>
-        <w:t xml:space="preserve">rewriting</w:t>
-      </w:r>
-      <w:r>
-        <w:t xml:space="preserve">’</w:t>
-      </w:r>
-      <w:r>
-        <w:t xml:space="preserve"> </w:t>
-      </w:r>
-      <w:r>
-        <w:t xml:space="preserve">or not - please remember you can</w:t>
-      </w:r>
-      <w:r>
-        <w:t xml:space="preserve"> </w:t>
-      </w:r>
-      <w:r>
-        <w:rPr>
-          <w:iCs/>
-          <w:i/>
-        </w:rPr>
-        <w:t xml:space="preserve">always ask me</w:t>
-      </w:r>
-      <w:r>
-        <w:t xml:space="preserve">!</w:t>
-      </w:r>
-    </w:p>
-    <w:p>
-      <w:pPr>
-        <w:pStyle w:val="BodyText"/>
-      </w:pPr>
-      <w:r>
-        <w:t xml:space="preserve">You may not use Generative AI to write text, summarize ideas, generate or brainstorm your own thesis or arguments, or outline your paper. The reason for this policy is that these are all foundational skills this class is designed to help you improve. Using AI effectively to do these tasks requires that you are able to do them as well, otherwise you will be unprepared to evaluate what the AI generates. You may or may not engage with AI in your writing processes outside of this class and outside of your time at St. Lawrence. This course will help you build the foundational skills to use these tools critically, and to evaluate how others use them.</w:t>
-      </w:r>
-    </w:p>
-    <w:bookmarkEnd w:id="35"/>
-    <w:bookmarkStart w:id="36" w:name="accessibility"/>
-    <w:p>
-      <w:pPr>
-        <w:pStyle w:val="Heading3"/>
-      </w:pPr>
-      <w:r>
-        <w:t xml:space="preserve">Accessibility</w:t>
-      </w:r>
-    </w:p>
-    <w:p>
-      <w:pPr>
-        <w:pStyle w:val="FirstParagraph"/>
-      </w:pPr>
-      <w:r>
-        <w:t xml:space="preserve">It is the policy and practice of St. Lawrence University to create inclusive and accessible learning environments consistent with federal and state law. If you have established permanent accommodations with the Student Accessibility Services (SAS) Office in the past and want to use them in your current courses, please activate your accommodations so you can discuss with your professors how they will be implemented.</w:t>
-      </w:r>
-    </w:p>
-    <w:p>
-      <w:pPr>
-        <w:pStyle w:val="BodyText"/>
-      </w:pPr>
-      <w:r>
-        <w:t xml:space="preserve">If you do not yet have services through the SAS Office but have a disability or temporary health condition that requires accommodations, please contact them directly to start the process of requesting accommodations and to receive guidance with the next steps.</w:t>
-      </w:r>
-    </w:p>
-    <w:p>
-      <w:pPr>
-        <w:pStyle w:val="BodyText"/>
-      </w:pPr>
-      <w:r>
-        <w:t xml:space="preserve">Contact information for Student Accessibility Services:</w:t>
-      </w:r>
-      <w:r>
-        <w:t xml:space="preserve"> </w:t>
-      </w:r>
-      <w:r>
-        <w:t xml:space="preserve">Telephone: 315.229.5537</w:t>
-      </w:r>
-      <w:r>
-        <w:t xml:space="preserve"> </w:t>
-      </w:r>
-      <w:r>
-        <w:t xml:space="preserve">Email: studentaccessibility@stlawu.edu</w:t>
+        <w:rPr>
+          <w:bCs/>
+          <w:b/>
+        </w:rPr>
+        <w:t xml:space="preserve">Unit One – Rationalist Foundations</w:t>
+      </w:r>
+    </w:p>
+    <w:p>
+      <w:pPr>
+        <w:pStyle w:val="BodyText"/>
+      </w:pPr>
+      <w:r>
+        <w:t xml:space="preserve">|</w:t>
+      </w:r>
+      <w:r>
+        <w:rPr>
+          <w:bCs/>
+          <w:b/>
+        </w:rPr>
+        <w:t xml:space="preserve">Date</w:t>
+      </w:r>
+      <w:r>
+        <w:t xml:space="preserve">|</w:t>
+      </w:r>
+      <w:r>
+        <w:rPr>
+          <w:bCs/>
+          <w:b/>
+        </w:rPr>
+        <w:t xml:space="preserve">Reading</w:t>
+      </w:r>
+      <w:r>
+        <w:t xml:space="preserve">|</w:t>
+      </w:r>
+      <w:r>
+        <w:rPr>
+          <w:bCs/>
+          <w:b/>
+        </w:rPr>
+        <w:t xml:space="preserve">Assignments Due</w:t>
+      </w:r>
+      <w:r>
+        <w:t xml:space="preserve">|</w:t>
+      </w:r>
+      <w:r>
+        <w:t xml:space="preserve"> </w:t>
+      </w:r>
+      <w:r>
+        <w:t xml:space="preserve">|Th. 1.15|Introduction - No Reading Due||</w:t>
       </w:r>
       <w:r>
         <w:br/>
       </w:r>
       <w:r>
-        <w:t xml:space="preserve">Website: https://www.stlawu.edu/offices/student-accessibility-services</w:t>
+        <w:t xml:space="preserve">|Tu. 1.20|Descartes,</w:t>
+      </w:r>
+      <w:r>
+        <w:t xml:space="preserve"> </w:t>
+      </w:r>
+      <w:r>
+        <w:rPr>
+          <w:iCs/>
+          <w:i/>
+        </w:rPr>
+        <w:t xml:space="preserve">Meditations on First Philosophy</w:t>
+      </w:r>
+      <w:r>
+        <w:t xml:space="preserve">, Meditations 1 and 2 (pgs. (40-47)||</w:t>
+      </w:r>
+      <w:r>
+        <w:t xml:space="preserve"> </w:t>
+      </w:r>
+      <w:r>
+        <w:t xml:space="preserve">|Th. 1.22|Descartes,</w:t>
+      </w:r>
+      <w:r>
+        <w:t xml:space="preserve"> </w:t>
+      </w:r>
+      <w:r>
+        <w:rPr>
+          <w:iCs/>
+          <w:i/>
+        </w:rPr>
+        <w:t xml:space="preserve">Meditations on First Philosophy</w:t>
+      </w:r>
+      <w:r>
+        <w:t xml:space="preserve">, Meditation 3 (pgs. (47-54)||</w:t>
+      </w:r>
+      <w:r>
+        <w:t xml:space="preserve"> </w:t>
+      </w:r>
+      <w:r>
+        <w:t xml:space="preserve">|Tu. 1.27|Descartes,</w:t>
+      </w:r>
+      <w:r>
+        <w:t xml:space="preserve"> </w:t>
+      </w:r>
+      <w:r>
+        <w:rPr>
+          <w:iCs/>
+          <w:i/>
+        </w:rPr>
+        <w:t xml:space="preserve">Meditations on First Philosophy</w:t>
+      </w:r>
+      <w:r>
+        <w:t xml:space="preserve">, Meditations 4 and 5 (pgs. (54-61)||</w:t>
+      </w:r>
+      <w:r>
+        <w:t xml:space="preserve"> </w:t>
+      </w:r>
+      <w:r>
+        <w:t xml:space="preserve">|Th. 1.29|Descartes,</w:t>
+      </w:r>
+      <w:r>
+        <w:t xml:space="preserve"> </w:t>
+      </w:r>
+      <w:r>
+        <w:rPr>
+          <w:iCs/>
+          <w:i/>
+        </w:rPr>
+        <w:t xml:space="preserve">Meditations on First Philosophy</w:t>
+      </w:r>
+      <w:r>
+        <w:t xml:space="preserve">, Meditation 6 (pgs. (61-68||</w:t>
+      </w:r>
+      <w:r>
+        <w:t xml:space="preserve"> </w:t>
+      </w:r>
+      <w:r>
+        <w:t xml:space="preserve">|Tu. 2.3|Princess Elisabeth and Descartes,</w:t>
+      </w:r>
+      <w:r>
+        <w:t xml:space="preserve"> </w:t>
+      </w:r>
+      <w:r>
+        <w:rPr>
+          <w:iCs/>
+          <w:i/>
+        </w:rPr>
+        <w:t xml:space="preserve">Correspondence</w:t>
+      </w:r>
+      <w:r>
+        <w:t xml:space="preserve"> </w:t>
+      </w:r>
+      <w:r>
+        <w:t xml:space="preserve">(pgs. (93-99)||</w:t>
+      </w:r>
+      <w:r>
+        <w:t xml:space="preserve"> </w:t>
+      </w:r>
+      <w:r>
+        <w:t xml:space="preserve">|Th. 2.5|Descartes and Hobbes,</w:t>
+      </w:r>
+      <w:r>
+        <w:t xml:space="preserve"> </w:t>
+      </w:r>
+      <w:r>
+        <w:rPr>
+          <w:iCs/>
+          <w:i/>
+        </w:rPr>
+        <w:t xml:space="preserve">Objections and Replies</w:t>
+      </w:r>
+      <w:r>
+        <w:t xml:space="preserve"> </w:t>
+      </w:r>
+      <w:r>
+        <w:t xml:space="preserve">Third Set of Replies (pgs. 76-79||</w:t>
+      </w:r>
+    </w:p>
+    <w:p>
+      <w:pPr>
+        <w:pStyle w:val="BodyText"/>
+      </w:pPr>
+      <w:r>
+        <w:rPr>
+          <w:bCs/>
+          <w:b/>
+        </w:rPr>
+        <w:t xml:space="preserve">Unit Two – Rationalist Debates</w:t>
+      </w:r>
+    </w:p>
+    <w:p>
+      <w:pPr>
+        <w:pStyle w:val="BodyText"/>
+      </w:pPr>
+      <w:r>
+        <w:t xml:space="preserve">|Tu. 2.10|Spinoza,</w:t>
+      </w:r>
+      <w:r>
+        <w:t xml:space="preserve"> </w:t>
+      </w:r>
+      <w:r>
+        <w:rPr>
+          <w:iCs/>
+          <w:i/>
+        </w:rPr>
+        <w:t xml:space="preserve">The Ethics</w:t>
+      </w:r>
+      <w:r>
+        <w:t xml:space="preserve">, to Proposition 16 (pgs. 172-179)|Oral Exam #1 This Week|</w:t>
+      </w:r>
+      <w:r>
+        <w:t xml:space="preserve"> </w:t>
+      </w:r>
+      <w:r>
+        <w:t xml:space="preserve">|Th. 2.12|Conway,</w:t>
+      </w:r>
+      <w:r>
+        <w:t xml:space="preserve"> </w:t>
+      </w:r>
+      <w:r>
+        <w:rPr>
+          <w:iCs/>
+          <w:i/>
+        </w:rPr>
+        <w:t xml:space="preserve">The Principles of the Most Ancient and Modern Philosophy</w:t>
+      </w:r>
+      <w:r>
+        <w:t xml:space="preserve">, Ch. 8 (pgs. 154-159)||</w:t>
+      </w:r>
+      <w:r>
+        <w:t xml:space="preserve"> </w:t>
+      </w:r>
+      <w:r>
+        <w:t xml:space="preserve">|Tu. 2.17|Conway,</w:t>
+      </w:r>
+      <w:r>
+        <w:t xml:space="preserve"> </w:t>
+      </w:r>
+      <w:r>
+        <w:rPr>
+          <w:iCs/>
+          <w:i/>
+        </w:rPr>
+        <w:t xml:space="preserve">The Principles of the Most Ancient and Modern Philosophy</w:t>
+      </w:r>
+      <w:r>
+        <w:t xml:space="preserve">, Ch. 8 (pgs. 154-159)||</w:t>
+      </w:r>
+      <w:r>
+        <w:t xml:space="preserve"> </w:t>
+      </w:r>
+      <w:r>
+        <w:t xml:space="preserve">|Th. 2.19|</w:t>
+      </w:r>
+      <w:r>
+        <w:rPr>
+          <w:iCs/>
+          <w:i/>
+        </w:rPr>
+        <w:t xml:space="preserve">No Class - Winter Break</w:t>
+      </w:r>
+      <w:r>
+        <w:t xml:space="preserve">||</w:t>
+      </w:r>
+      <w:r>
+        <w:t xml:space="preserve"> </w:t>
+      </w:r>
+      <w:r>
+        <w:t xml:space="preserve">|Tu. 2.24|Leibniz,</w:t>
+      </w:r>
+      <w:r>
+        <w:t xml:space="preserve"> </w:t>
+      </w:r>
+      <w:r>
+        <w:rPr>
+          <w:iCs/>
+          <w:i/>
+        </w:rPr>
+        <w:t xml:space="preserve">Monadology</w:t>
+      </w:r>
+      <w:r>
+        <w:t xml:space="preserve">, to paragraphs 1-48 (pgs. 303-307)||</w:t>
+      </w:r>
+      <w:r>
+        <w:t xml:space="preserve"> </w:t>
+      </w:r>
+      <w:r>
+        <w:t xml:space="preserve">|Th. 2.26|Leibniz,</w:t>
+      </w:r>
+      <w:r>
+        <w:t xml:space="preserve"> </w:t>
+      </w:r>
+      <w:r>
+        <w:rPr>
+          <w:iCs/>
+          <w:i/>
+        </w:rPr>
+        <w:t xml:space="preserve">Monadology</w:t>
+      </w:r>
+      <w:r>
+        <w:t xml:space="preserve">, to paragraphs 48-end (pgs. 307-311)||</w:t>
+      </w:r>
+    </w:p>
+    <w:p>
+      <w:pPr>
+        <w:pStyle w:val="BodyText"/>
+      </w:pPr>
+      <w:r>
+        <w:rPr>
+          <w:bCs/>
+          <w:b/>
+        </w:rPr>
+        <w:t xml:space="preserve">Unit Three – The Empiricists</w:t>
+      </w:r>
+    </w:p>
+    <w:p>
+      <w:pPr>
+        <w:pStyle w:val="BodyText"/>
+      </w:pPr>
+      <w:r>
+        <w:t xml:space="preserve">|</w:t>
+      </w:r>
+      <w:r>
+        <w:rPr>
+          <w:bCs/>
+          <w:b/>
+        </w:rPr>
+        <w:t xml:space="preserve">Date</w:t>
+      </w:r>
+      <w:r>
+        <w:t xml:space="preserve">|</w:t>
+      </w:r>
+      <w:r>
+        <w:rPr>
+          <w:bCs/>
+          <w:b/>
+        </w:rPr>
+        <w:t xml:space="preserve">Reading</w:t>
+      </w:r>
+      <w:r>
+        <w:t xml:space="preserve">|</w:t>
+      </w:r>
+      <w:r>
+        <w:rPr>
+          <w:bCs/>
+          <w:b/>
+        </w:rPr>
+        <w:t xml:space="preserve">Assignments Due</w:t>
+      </w:r>
+      <w:r>
+        <w:t xml:space="preserve">|</w:t>
+      </w:r>
+      <w:r>
+        <w:t xml:space="preserve"> </w:t>
+      </w:r>
+      <w:r>
+        <w:t xml:space="preserve">|Tu. 3.3|Locke,</w:t>
+      </w:r>
+      <w:r>
+        <w:t xml:space="preserve"> </w:t>
+      </w:r>
+      <w:r>
+        <w:rPr>
+          <w:iCs/>
+          <w:i/>
+        </w:rPr>
+        <w:t xml:space="preserve">Essay Concerning Human Understanding</w:t>
+      </w:r>
+      <w:r>
+        <w:t xml:space="preserve">, Bk. I, Ch. 1-2 (pgs. 346-352)|Oral Exam #2 This Week|</w:t>
+      </w:r>
+      <w:r>
+        <w:br/>
+      </w:r>
+      <w:r>
+        <w:t xml:space="preserve">|Th. 3.5|Locke,</w:t>
+      </w:r>
+      <w:r>
+        <w:t xml:space="preserve"> </w:t>
+      </w:r>
+      <w:r>
+        <w:rPr>
+          <w:iCs/>
+          <w:i/>
+        </w:rPr>
+        <w:t xml:space="preserve">Essay Concerning Human Understanding</w:t>
+      </w:r>
+      <w:r>
+        <w:t xml:space="preserve">, Bk. II, Ch. 1-3, Ch. 7 (to paragraph 14) (pgs. 352-359, 362-364)||</w:t>
+      </w:r>
+      <w:r>
+        <w:t xml:space="preserve"> </w:t>
+      </w:r>
+      <w:r>
+        <w:t xml:space="preserve">|Tu. 3.10|Locke,</w:t>
+      </w:r>
+      <w:r>
+        <w:t xml:space="preserve"> </w:t>
+      </w:r>
+      <w:r>
+        <w:rPr>
+          <w:iCs/>
+          <w:i/>
+        </w:rPr>
+        <w:t xml:space="preserve">Essay Concerning Human Understanding</w:t>
+      </w:r>
+      <w:r>
+        <w:t xml:space="preserve">, Bk. II, Ch. 10-12, 22 (pgs. 369-372, 387-389)||</w:t>
+      </w:r>
+      <w:r>
+        <w:br/>
+      </w:r>
+      <w:r>
+        <w:t xml:space="preserve">|Th. 3.12|Locke,</w:t>
+      </w:r>
+      <w:r>
+        <w:t xml:space="preserve"> </w:t>
+      </w:r>
+      <w:r>
+        <w:rPr>
+          <w:iCs/>
+          <w:i/>
+        </w:rPr>
+        <w:t xml:space="preserve">Essay Concerning Human Understanding</w:t>
+      </w:r>
+      <w:r>
+        <w:t xml:space="preserve">, Bk. IV, Ch. 1-2 (pgs. 416-422)|Project Proposal|</w:t>
+      </w:r>
+      <w:r>
+        <w:t xml:space="preserve"> </w:t>
+      </w:r>
+      <w:r>
+        <w:t xml:space="preserve">|Tu. 3.17|Berkeley,</w:t>
+      </w:r>
+      <w:r>
+        <w:t xml:space="preserve"> </w:t>
+      </w:r>
+      <w:r>
+        <w:rPr>
+          <w:iCs/>
+          <w:i/>
+        </w:rPr>
+        <w:t xml:space="preserve">Principles of Human Knowledge</w:t>
+      </w:r>
+      <w:r>
+        <w:t xml:space="preserve">, Part I (pgs 487-493)|Oral Exam #3 This Week (or after break)|</w:t>
+      </w:r>
+      <w:r>
+        <w:br/>
+      </w:r>
+      <w:r>
+        <w:t xml:space="preserve">|Th. 3.19|Lady Shepherd,</w:t>
+      </w:r>
+      <w:r>
+        <w:t xml:space="preserve"> </w:t>
+      </w:r>
+      <w:r>
+        <w:rPr>
+          <w:iCs/>
+          <w:i/>
+        </w:rPr>
+        <w:t xml:space="preserve">Essays on the Perception of an External Universe</w:t>
+      </w:r>
+      <w:r>
+        <w:t xml:space="preserve"> </w:t>
+      </w:r>
+      <w:r>
+        <w:t xml:space="preserve">(pgs. 549-553)||</w:t>
+      </w:r>
+      <w:r>
+        <w:t xml:space="preserve"> </w:t>
+      </w:r>
+      <w:r>
+        <w:t xml:space="preserve">|M. 3.23|</w:t>
+      </w:r>
+      <w:r>
+        <w:rPr>
+          <w:iCs/>
+          <w:i/>
+        </w:rPr>
+        <w:t xml:space="preserve">Spring Break - No Class</w:t>
+      </w:r>
+      <w:r>
+        <w:t xml:space="preserve">||</w:t>
+      </w:r>
+      <w:r>
+        <w:t xml:space="preserve"> </w:t>
+      </w:r>
+      <w:r>
+        <w:t xml:space="preserve">|W. 3.25|</w:t>
+      </w:r>
+      <w:r>
+        <w:rPr>
+          <w:iCs/>
+          <w:i/>
+        </w:rPr>
+        <w:t xml:space="preserve">Spring Break - No Class</w:t>
+      </w:r>
+      <w:r>
+        <w:t xml:space="preserve">||</w:t>
+      </w:r>
+    </w:p>
+    <w:p>
+      <w:pPr>
+        <w:pStyle w:val="BodyText"/>
+      </w:pPr>
+      <w:r>
+        <w:rPr>
+          <w:bCs/>
+          <w:b/>
+        </w:rPr>
+        <w:t xml:space="preserve">Unit Four – Hume and Kant</w:t>
+      </w:r>
+    </w:p>
+    <w:p>
+      <w:pPr>
+        <w:pStyle w:val="BodyText"/>
+      </w:pPr>
+      <w:r>
+        <w:t xml:space="preserve">|</w:t>
+      </w:r>
+      <w:r>
+        <w:rPr>
+          <w:bCs/>
+          <w:b/>
+        </w:rPr>
+        <w:t xml:space="preserve">Date</w:t>
+      </w:r>
+      <w:r>
+        <w:t xml:space="preserve">|</w:t>
+      </w:r>
+      <w:r>
+        <w:rPr>
+          <w:bCs/>
+          <w:b/>
+        </w:rPr>
+        <w:t xml:space="preserve">Reading</w:t>
+      </w:r>
+      <w:r>
+        <w:t xml:space="preserve">|</w:t>
+      </w:r>
+      <w:r>
+        <w:rPr>
+          <w:bCs/>
+          <w:b/>
+        </w:rPr>
+        <w:t xml:space="preserve">Assignments Due</w:t>
+      </w:r>
+      <w:r>
+        <w:t xml:space="preserve">|</w:t>
+      </w:r>
+      <w:r>
+        <w:t xml:space="preserve"> </w:t>
+      </w:r>
+      <w:r>
+        <w:t xml:space="preserve">|Tu. 3.31|Hume,</w:t>
+      </w:r>
+      <w:r>
+        <w:t xml:space="preserve"> </w:t>
+      </w:r>
+      <w:r>
+        <w:rPr>
+          <w:iCs/>
+          <w:i/>
+        </w:rPr>
+        <w:t xml:space="preserve">Enquiry Concerning Human Understanding</w:t>
+      </w:r>
+      <w:r>
+        <w:t xml:space="preserve">, Sections 1-3 (pgs. 579-588)||</w:t>
+      </w:r>
+      <w:r>
+        <w:t xml:space="preserve"> </w:t>
+      </w:r>
+      <w:r>
+        <w:t xml:space="preserve">|Th. 4.2|Hume,</w:t>
+      </w:r>
+      <w:r>
+        <w:t xml:space="preserve"> </w:t>
+      </w:r>
+      <w:r>
+        <w:rPr>
+          <w:iCs/>
+          <w:i/>
+        </w:rPr>
+        <w:t xml:space="preserve">Enquiry Concerning Human Understanding</w:t>
+      </w:r>
+      <w:r>
+        <w:t xml:space="preserve">, Sections 4-5 (pgs. 588-601)||</w:t>
+      </w:r>
+      <w:r>
+        <w:t xml:space="preserve"> </w:t>
+      </w:r>
+      <w:r>
+        <w:t xml:space="preserve">|Tu. 4.7|Hume,</w:t>
+      </w:r>
+      <w:r>
+        <w:t xml:space="preserve"> </w:t>
+      </w:r>
+      <w:r>
+        <w:rPr>
+          <w:iCs/>
+          <w:i/>
+        </w:rPr>
+        <w:t xml:space="preserve">Enquiry Concerning Human Understanding</w:t>
+      </w:r>
+      <w:r>
+        <w:t xml:space="preserve">, Sections 6-7 (pgs. 601-610)||</w:t>
+      </w:r>
+      <w:r>
+        <w:br/>
+      </w:r>
+      <w:r>
+        <w:t xml:space="preserve">|Th. 4.9|Hume,</w:t>
+      </w:r>
+      <w:r>
+        <w:t xml:space="preserve"> </w:t>
+      </w:r>
+      <w:r>
+        <w:rPr>
+          <w:iCs/>
+          <w:i/>
+        </w:rPr>
+        <w:t xml:space="preserve">Enquiry Concerning Human Understanding</w:t>
+      </w:r>
+      <w:r>
+        <w:t xml:space="preserve">, Section 8 (pgs. 610-621)|Argument Paper|</w:t>
+      </w:r>
+      <w:r>
+        <w:br/>
+      </w:r>
+      <w:r>
+        <w:t xml:space="preserve">|Tu. 4.14|Kant,</w:t>
+      </w:r>
+      <w:r>
+        <w:t xml:space="preserve"> </w:t>
+      </w:r>
+      <w:r>
+        <w:rPr>
+          <w:iCs/>
+          <w:i/>
+        </w:rPr>
+        <w:t xml:space="preserve">Prolegomena to Any Future Metaphysics</w:t>
+      </w:r>
+      <w:r>
+        <w:t xml:space="preserve">, Preface and Preamble (pgs. 719-730)||</w:t>
+      </w:r>
+      <w:r>
+        <w:br/>
+      </w:r>
+      <w:r>
+        <w:t xml:space="preserve">|Th. 4.16|Kant,</w:t>
+      </w:r>
+      <w:r>
+        <w:t xml:space="preserve"> </w:t>
+      </w:r>
+      <w:r>
+        <w:rPr>
+          <w:iCs/>
+          <w:i/>
+        </w:rPr>
+        <w:t xml:space="preserve">Prolegomena to Any Future Metaphysics</w:t>
+      </w:r>
+      <w:r>
+        <w:t xml:space="preserve">, Part II to §24 (pgs. 737-743)||</w:t>
+      </w:r>
+      <w:r>
+        <w:t xml:space="preserve"> </w:t>
+      </w:r>
+      <w:r>
+        <w:t xml:space="preserve">|Tu. 4.21|Kant,</w:t>
+      </w:r>
+      <w:r>
+        <w:t xml:space="preserve"> </w:t>
+      </w:r>
+      <w:r>
+        <w:rPr>
+          <w:iCs/>
+          <w:i/>
+        </w:rPr>
+        <w:t xml:space="preserve">Prolegomena to Any Future Metaphysics</w:t>
+      </w:r>
+      <w:r>
+        <w:t xml:space="preserve">, Part II to §39 (pgs. 743-750)|Reply Paper|</w:t>
+      </w:r>
+      <w:r>
+        <w:t xml:space="preserve"> </w:t>
+      </w:r>
+      <w:r>
+        <w:t xml:space="preserve">|Th. 4.22|Kant,</w:t>
+      </w:r>
+      <w:r>
+        <w:t xml:space="preserve"> </w:t>
+      </w:r>
+      <w:r>
+        <w:rPr>
+          <w:iCs/>
+          <w:i/>
+        </w:rPr>
+        <w:t xml:space="preserve">Prolegomena to Any Future Metaphysics</w:t>
+      </w:r>
+      <w:r>
+        <w:t xml:space="preserve">, Part III, §40 to §55 (pgs. 753-763)||</w:t>
+      </w:r>
+      <w:r>
+        <w:br/>
+      </w:r>
+      <w:r>
+        <w:t xml:space="preserve">|Tu. 4.28|Kant,</w:t>
+      </w:r>
+      <w:r>
+        <w:t xml:space="preserve"> </w:t>
+      </w:r>
+      <w:r>
+        <w:rPr>
+          <w:iCs/>
+          <w:i/>
+        </w:rPr>
+        <w:t xml:space="preserve">Prolegomena to Any Future Metaphysics</w:t>
+      </w:r>
+      <w:r>
+        <w:t xml:space="preserve">, Part III, §55 to Scholium (pgs. 763-771)||</w:t>
+      </w:r>
+      <w:r>
+        <w:br/>
+      </w:r>
+      <w:r>
+        <w:t xml:space="preserve">|Th. 4.30|Wrapping Up||</w:t>
       </w:r>
     </w:p>
     <w:bookmarkEnd w:id="36"/>
-    <w:bookmarkStart w:id="37" w:name="title-ix-statement"/>
-    <w:p>
-      <w:pPr>
-        <w:pStyle w:val="Heading3"/>
-      </w:pPr>
-      <w:r>
-        <w:t xml:space="preserve">Title IX Statement</w:t>
-      </w:r>
-    </w:p>
-    <w:p>
-      <w:pPr>
-        <w:pStyle w:val="FirstParagraph"/>
-      </w:pPr>
-      <w:r>
-        <w:t xml:space="preserve">MEMBERS OF THE ST. LAWRENCE COMMUNITY—students, employees, and guests— should expect to be free from retaliation, discrimination, harassment, and sexual misconduct, behavior that is inherently abusive of the humanity that each of us brings to the campus community. St. Lawrence University and its faculty are committed to supporting our students and seeking an environment that is free of discrimination, harassment, and sexual misconduct. St. Lawrence strongly encourages students to report retaliation, discrimination, harassment, including sexual harassment, sexual exploitation, domestic violence, dating violence, stalking, or sexual assault to St. Lawrence University’s Title IX office. Discrimination on the basis of sex includes discrimination on the basis of assigned sex at birth, sex characteristics, pregnancy and pregnancy related conditions, sexual orientation, and gender identity.</w:t>
-      </w:r>
-    </w:p>
-    <w:p>
-      <w:pPr>
-        <w:pStyle w:val="BodyText"/>
-      </w:pPr>
-      <w:r>
-        <w:t xml:space="preserve">If you speak with a faculty member about an incident that involves a Title IX matter or matter of other discrimination or harassment, that faculty member must notify SLU’s Title IX Coordinator that you shared that experience. This is true even if you ask the faculty member not to disclose the incident. Moreover, if you disclose an incident of retaliation, discrimination, harassment, or sexual misconduct in an academic assignment, the faculty member must also report that experience to the Title IX Coordinator.</w:t>
-      </w:r>
-    </w:p>
-    <w:p>
-      <w:pPr>
-        <w:pStyle w:val="BodyText"/>
-      </w:pPr>
-      <w:r>
-        <w:t xml:space="preserve">Once a report is made, the reporting individual can expect to receive email outreach from the Title IX Coordinator, who will provide resources and possible resolution options. If the impacted person is not a threat to themselves or others, the impacted person will be free not to respond to the offer to meet. You can find more information for resources and reporting options at: https://www.stlawu.edu/offices/title-ix/reporting-options-confidential-and-nonconfidential-resources.</w:t>
-      </w:r>
-    </w:p>
-    <w:p>
-      <w:pPr>
-        <w:pStyle w:val="BodyText"/>
-      </w:pPr>
-      <w:r>
-        <w:t xml:space="preserve">Title IX also protects students who are pregnant or need assistance for pregnancy related conditions. If you are pregnant, the Title IX Coordinator can assist you in understanding your rights and options as well as provide supportive measures.</w:t>
-      </w:r>
-      <w:r>
-        <w:t xml:space="preserve"> </w:t>
-      </w:r>
-      <w:r>
-        <w:t xml:space="preserve">Lindsey Tropper (Cohen) is the Title IX Coordinator at St. Lawrence University (Student Center Room 302; lcohen@stlawu.edu; 315-229-5334).</w:t>
-      </w:r>
-    </w:p>
-    <w:bookmarkEnd w:id="37"/>
-    <w:bookmarkEnd w:id="38"/>
-    <w:bookmarkStart w:id="39" w:name="calendar"/>
-    <w:p>
-      <w:pPr>
-        <w:pStyle w:val="Heading2"/>
-      </w:pPr>
-      <w:r>
-        <w:t xml:space="preserve">Calendar</w:t>
-      </w:r>
-    </w:p>
-    <w:p>
-      <w:pPr>
-        <w:pStyle w:val="FirstParagraph"/>
-      </w:pPr>
-      <w:r>
-        <w:rPr>
-          <w:bCs/>
-          <w:b/>
-        </w:rPr>
-        <w:t xml:space="preserve">Unit One – Foundational Concepts in The Philosophy of Mind</w:t>
-      </w:r>
-    </w:p>
-    <w:p>
-      <w:pPr>
-        <w:pStyle w:val="BodyText"/>
-      </w:pPr>
-      <w:r>
-        <w:t xml:space="preserve">|</w:t>
-      </w:r>
-      <w:r>
-        <w:rPr>
-          <w:bCs/>
-          <w:b/>
-        </w:rPr>
-        <w:t xml:space="preserve">Date</w:t>
-      </w:r>
-      <w:r>
-        <w:t xml:space="preserve">|</w:t>
-      </w:r>
-      <w:r>
-        <w:rPr>
-          <w:bCs/>
-          <w:b/>
-        </w:rPr>
-        <w:t xml:space="preserve">Topic</w:t>
-      </w:r>
-      <w:r>
-        <w:t xml:space="preserve">|</w:t>
-      </w:r>
-      <w:r>
-        <w:rPr>
-          <w:bCs/>
-          <w:b/>
-        </w:rPr>
-        <w:t xml:space="preserve">Reading</w:t>
-      </w:r>
-      <w:r>
-        <w:t xml:space="preserve">|</w:t>
-      </w:r>
-      <w:r>
-        <w:rPr>
-          <w:bCs/>
-          <w:b/>
-        </w:rPr>
-        <w:t xml:space="preserve">Assignments Due</w:t>
-      </w:r>
-      <w:r>
-        <w:t xml:space="preserve">|</w:t>
-      </w:r>
-      <w:r>
-        <w:t xml:space="preserve"> </w:t>
-      </w:r>
-      <w:r>
-        <w:t xml:space="preserve">|W. 1.15|Minds and Computers ||</w:t>
-      </w:r>
-      <w:r>
-        <w:br/>
-      </w:r>
-      <w:r>
-        <w:t xml:space="preserve">|M. 1.20|Dualism|Carter, Ch. 1-2||</w:t>
-      </w:r>
-      <w:r>
-        <w:br/>
-      </w:r>
-      <w:r>
-        <w:t xml:space="preserve">|W. 1.22|Behaviorism|Carter, Ch. 3|Homework #1|</w:t>
-      </w:r>
-      <w:r>
-        <w:t xml:space="preserve"> </w:t>
-      </w:r>
-      <w:r>
-        <w:t xml:space="preserve">|M. 1.27|Identity Theory|Carter, Ch. 5||</w:t>
-      </w:r>
-      <w:r>
-        <w:br/>
-      </w:r>
-      <w:r>
-        <w:t xml:space="preserve">|W. 1.29|Functionalism|Carter, Ch. 6|Homework #2|</w:t>
-      </w:r>
-    </w:p>
-    <w:p>
-      <w:pPr>
-        <w:pStyle w:val="BodyText"/>
-      </w:pPr>
-      <w:r>
-        <w:rPr>
-          <w:bCs/>
-          <w:b/>
-        </w:rPr>
-        <w:t xml:space="preserve">Unit Two - Computability</w:t>
-      </w:r>
-    </w:p>
-    <w:p>
-      <w:pPr>
-        <w:pStyle w:val="BodyText"/>
-      </w:pPr>
-      <w:r>
-        <w:t xml:space="preserve">|</w:t>
-      </w:r>
-      <w:r>
-        <w:rPr>
-          <w:bCs/>
-          <w:b/>
-        </w:rPr>
-        <w:t xml:space="preserve">Date</w:t>
-      </w:r>
-      <w:r>
-        <w:t xml:space="preserve">|</w:t>
-      </w:r>
-      <w:r>
-        <w:rPr>
-          <w:bCs/>
-          <w:b/>
-        </w:rPr>
-        <w:t xml:space="preserve">Topic</w:t>
-      </w:r>
-      <w:r>
-        <w:t xml:space="preserve">|</w:t>
-      </w:r>
-      <w:r>
-        <w:rPr>
-          <w:bCs/>
-          <w:b/>
-        </w:rPr>
-        <w:t xml:space="preserve">Reading</w:t>
-      </w:r>
-      <w:r>
-        <w:t xml:space="preserve">|</w:t>
-      </w:r>
-      <w:r>
-        <w:rPr>
-          <w:bCs/>
-          <w:b/>
-        </w:rPr>
-        <w:t xml:space="preserve">Assignments Due</w:t>
-      </w:r>
-      <w:r>
-        <w:t xml:space="preserve">|</w:t>
-      </w:r>
-      <w:r>
-        <w:t xml:space="preserve"> </w:t>
-      </w:r>
-      <w:r>
-        <w:t xml:space="preserve">|M. 2.3|Formal Systems|Carter, Ch. 7||</w:t>
-      </w:r>
-      <w:r>
-        <w:t xml:space="preserve"> </w:t>
-      </w:r>
-      <w:r>
-        <w:t xml:space="preserve">|W. 2.5|Computability|Carter, Ch. 8|Homework #3|</w:t>
-      </w:r>
-      <w:r>
-        <w:t xml:space="preserve"> </w:t>
-      </w:r>
-      <w:r>
-        <w:t xml:space="preserve">|M. 2.10|Universal Machines|Carter, Ch. 9||</w:t>
-      </w:r>
-    </w:p>
-    <w:p>
-      <w:pPr>
-        <w:pStyle w:val="BodyText"/>
-      </w:pPr>
-      <w:r>
-        <w:rPr>
-          <w:bCs/>
-          <w:b/>
-        </w:rPr>
-        <w:t xml:space="preserve">Unit Three – Computationalism and GOFAI</w:t>
-      </w:r>
-    </w:p>
-    <w:p>
-      <w:pPr>
-        <w:pStyle w:val="BodyText"/>
-      </w:pPr>
-      <w:r>
-        <w:t xml:space="preserve">|</w:t>
-      </w:r>
-      <w:r>
-        <w:rPr>
-          <w:bCs/>
-          <w:b/>
-        </w:rPr>
-        <w:t xml:space="preserve">Date</w:t>
-      </w:r>
-      <w:r>
-        <w:t xml:space="preserve">|</w:t>
-      </w:r>
-      <w:r>
-        <w:rPr>
-          <w:bCs/>
-          <w:b/>
-        </w:rPr>
-        <w:t xml:space="preserve">Topic</w:t>
-      </w:r>
-      <w:r>
-        <w:t xml:space="preserve">|</w:t>
-      </w:r>
-      <w:r>
-        <w:rPr>
-          <w:bCs/>
-          <w:b/>
-        </w:rPr>
-        <w:t xml:space="preserve">Reading</w:t>
-      </w:r>
-      <w:r>
-        <w:t xml:space="preserve">|</w:t>
-      </w:r>
-      <w:r>
-        <w:rPr>
-          <w:bCs/>
-          <w:b/>
-        </w:rPr>
-        <w:t xml:space="preserve">Assignments Due</w:t>
-      </w:r>
-      <w:r>
-        <w:t xml:space="preserve">|</w:t>
-      </w:r>
-      <w:r>
-        <w:t xml:space="preserve"> </w:t>
-      </w:r>
-      <w:r>
-        <w:t xml:space="preserve">|W. 2.12|Computationalism| Carter, Ch, 10 ||</w:t>
-      </w:r>
-      <w:r>
-        <w:t xml:space="preserve"> </w:t>
-      </w:r>
-      <w:r>
-        <w:t xml:space="preserve">|M. 2.17|Computationalism, Continued|Fodor,</w:t>
-      </w:r>
-      <w:r>
-        <w:t xml:space="preserve"> </w:t>
-      </w:r>
-      <w:r>
-        <w:t xml:space="preserve">“</w:t>
-      </w:r>
-      <w:r>
-        <w:t xml:space="preserve">Methodological Solipsism…</w:t>
-      </w:r>
-      <w:r>
-        <w:t xml:space="preserve">”</w:t>
-      </w:r>
-      <w:r>
-        <w:t xml:space="preserve">||</w:t>
-      </w:r>
-      <w:r>
-        <w:br/>
-      </w:r>
-      <w:r>
-        <w:t xml:space="preserve">|W. 2.19|Techniques Carter, Ch. 11-12|Homework #4||</w:t>
-      </w:r>
-      <w:r>
-        <w:t xml:space="preserve"> </w:t>
-      </w:r>
-      <w:r>
-        <w:t xml:space="preserve">|M. 2.24|Machine Reasoning and Language|Carter, Ch. 13-14||</w:t>
-      </w:r>
-      <w:r>
-        <w:t xml:space="preserve"> </w:t>
-      </w:r>
-      <w:r>
-        <w:t xml:space="preserve">|W. 2.26|Human Reasoning and Language|Carter, Ch. 15-16|Homework #5|</w:t>
-      </w:r>
-      <w:r>
-        <w:t xml:space="preserve"> </w:t>
-      </w:r>
-      <w:r>
-        <w:t xml:space="preserve">|M. 3.3|Meaning and Representation|Carter, Ch. 17-18||</w:t>
-      </w:r>
-    </w:p>
-    <w:p>
-      <w:pPr>
-        <w:pStyle w:val="BodyText"/>
-      </w:pPr>
-      <w:r>
-        <w:rPr>
-          <w:bCs/>
-          <w:b/>
-        </w:rPr>
-        <w:t xml:space="preserve">Unit Four – Deep Learning and LLMs</w:t>
-      </w:r>
-    </w:p>
-    <w:p>
-      <w:pPr>
-        <w:pStyle w:val="BodyText"/>
-      </w:pPr>
-      <w:r>
-        <w:t xml:space="preserve">|</w:t>
-      </w:r>
-      <w:r>
-        <w:rPr>
-          <w:bCs/>
-          <w:b/>
-        </w:rPr>
-        <w:t xml:space="preserve">Date</w:t>
-      </w:r>
-      <w:r>
-        <w:t xml:space="preserve">|</w:t>
-      </w:r>
-      <w:r>
-        <w:rPr>
-          <w:bCs/>
-          <w:b/>
-        </w:rPr>
-        <w:t xml:space="preserve">Topic</w:t>
-      </w:r>
-      <w:r>
-        <w:t xml:space="preserve">|</w:t>
-      </w:r>
-      <w:r>
-        <w:rPr>
-          <w:bCs/>
-          <w:b/>
-        </w:rPr>
-        <w:t xml:space="preserve">Reading</w:t>
-      </w:r>
-      <w:r>
-        <w:t xml:space="preserve">|</w:t>
-      </w:r>
-      <w:r>
-        <w:rPr>
-          <w:bCs/>
-          <w:b/>
-        </w:rPr>
-        <w:t xml:space="preserve">Assignments Due</w:t>
-      </w:r>
-      <w:r>
-        <w:t xml:space="preserve">|</w:t>
-      </w:r>
-      <w:r>
-        <w:t xml:space="preserve"> </w:t>
-      </w:r>
-      <w:r>
-        <w:t xml:space="preserve">|W. 3.5|Neural Networks|Carter, Ch. 19|Homework #6, Research Bank Due|</w:t>
-      </w:r>
-      <w:r>
-        <w:t xml:space="preserve"> </w:t>
-      </w:r>
-      <w:r>
-        <w:t xml:space="preserve">|M. 3.10|ChatGPT|Lee and Trott,</w:t>
-      </w:r>
-      <w:r>
-        <w:t xml:space="preserve"> </w:t>
-      </w:r>
-      <w:r>
-        <w:t xml:space="preserve">“</w:t>
-      </w:r>
-      <w:r>
-        <w:t xml:space="preserve">A Jargon-free…</w:t>
-      </w:r>
-      <w:r>
-        <w:t xml:space="preserve">”</w:t>
-      </w:r>
-      <w:r>
-        <w:t xml:space="preserve">||</w:t>
-      </w:r>
-      <w:r>
-        <w:br/>
-      </w:r>
-      <w:r>
-        <w:t xml:space="preserve">|W. 3.12|LLMs and Understanding|Titus,</w:t>
-      </w:r>
-      <w:r>
-        <w:t xml:space="preserve"> </w:t>
-      </w:r>
-      <w:r>
-        <w:t xml:space="preserve">“</w:t>
-      </w:r>
-      <w:r>
-        <w:t xml:space="preserve">Does ChatGPT have semantic understanding?</w:t>
-      </w:r>
-      <w:r>
-        <w:t xml:space="preserve">”</w:t>
-      </w:r>
-      <w:r>
-        <w:t xml:space="preserve">|Homework #7|</w:t>
-      </w:r>
-    </w:p>
-    <w:p>
-      <w:pPr>
-        <w:pStyle w:val="BodyText"/>
-      </w:pPr>
-      <w:r>
-        <w:rPr>
-          <w:iCs/>
-          <w:i/>
-        </w:rPr>
-        <w:t xml:space="preserve">Spring Break – No Class on 3/17 or 3/19</w:t>
-      </w:r>
-    </w:p>
-    <w:p>
-      <w:pPr>
-        <w:pStyle w:val="BodyText"/>
-      </w:pPr>
-      <w:r>
-        <w:rPr>
-          <w:bCs/>
-          <w:b/>
-        </w:rPr>
-        <w:t xml:space="preserve">Unit Five – The Ethics of AI</w:t>
-      </w:r>
-    </w:p>
-    <w:p>
-      <w:pPr>
-        <w:pStyle w:val="BodyText"/>
-      </w:pPr>
-      <w:r>
-        <w:t xml:space="preserve">|</w:t>
-      </w:r>
-      <w:r>
-        <w:rPr>
-          <w:bCs/>
-          <w:b/>
-        </w:rPr>
-        <w:t xml:space="preserve">Date</w:t>
-      </w:r>
-      <w:r>
-        <w:t xml:space="preserve">|</w:t>
-      </w:r>
-      <w:r>
-        <w:rPr>
-          <w:bCs/>
-          <w:b/>
-        </w:rPr>
-        <w:t xml:space="preserve">Topic</w:t>
-      </w:r>
-      <w:r>
-        <w:t xml:space="preserve">|</w:t>
-      </w:r>
-      <w:r>
-        <w:rPr>
-          <w:bCs/>
-          <w:b/>
-        </w:rPr>
-        <w:t xml:space="preserve">Reading</w:t>
-      </w:r>
-      <w:r>
-        <w:t xml:space="preserve">|</w:t>
-      </w:r>
-      <w:r>
-        <w:rPr>
-          <w:bCs/>
-          <w:b/>
-        </w:rPr>
-        <w:t xml:space="preserve">Assignments Due</w:t>
-      </w:r>
-      <w:r>
-        <w:t xml:space="preserve">|</w:t>
-      </w:r>
-      <w:r>
-        <w:t xml:space="preserve"> </w:t>
-      </w:r>
-      <w:r>
-        <w:t xml:space="preserve">|M. 3.24|Can AI be conscious?|Chalmers,</w:t>
-      </w:r>
-      <w:r>
-        <w:t xml:space="preserve"> </w:t>
-      </w:r>
-      <w:r>
-        <w:t xml:space="preserve">“</w:t>
-      </w:r>
-      <w:r>
-        <w:t xml:space="preserve">Could a Large Language Model be Conscious?</w:t>
-      </w:r>
-      <w:r>
-        <w:t xml:space="preserve">”</w:t>
-      </w:r>
-      <w:r>
-        <w:t xml:space="preserve">||</w:t>
-      </w:r>
-      <w:r>
-        <w:br/>
-      </w:r>
-      <w:r>
-        <w:t xml:space="preserve">|W. 3.26|Can AI be creative?|Brainard,</w:t>
-      </w:r>
-      <w:r>
-        <w:t xml:space="preserve"> </w:t>
-      </w:r>
-      <w:r>
-        <w:t xml:space="preserve">“</w:t>
-      </w:r>
-      <w:r>
-        <w:t xml:space="preserve">The Curious Case of Uncurious Creation</w:t>
-      </w:r>
-      <w:r>
-        <w:t xml:space="preserve">”</w:t>
-      </w:r>
-      <w:r>
-        <w:t xml:space="preserve">|Argument Outline Due|</w:t>
-      </w:r>
-      <w:r>
-        <w:t xml:space="preserve"> </w:t>
-      </w:r>
-      <w:r>
-        <w:t xml:space="preserve">|M. 3.31|Ethical AI Decision-Making|Geisslinger, et al. </w:t>
-      </w:r>
-      <w:r>
-        <w:t xml:space="preserve">“</w:t>
-      </w:r>
-      <w:r>
-        <w:t xml:space="preserve">Autonomous Driving Ethics</w:t>
-      </w:r>
-      <w:r>
-        <w:t xml:space="preserve">”</w:t>
-      </w:r>
-      <w:r>
-        <w:t xml:space="preserve">||</w:t>
-      </w:r>
-      <w:r>
-        <w:br/>
-      </w:r>
-      <w:r>
-        <w:t xml:space="preserve">|W. 4.2|AI and Moral Responsibility|Goetze,</w:t>
-      </w:r>
-      <w:r>
-        <w:t xml:space="preserve"> </w:t>
-      </w:r>
-      <w:r>
-        <w:t xml:space="preserve">“</w:t>
-      </w:r>
-      <w:r>
-        <w:t xml:space="preserve">Mind the Gap</w:t>
-      </w:r>
-      <w:r>
-        <w:t xml:space="preserve">”</w:t>
-      </w:r>
-      <w:r>
-        <w:t xml:space="preserve">|Peer Review of Outlines Due|</w:t>
-      </w:r>
-      <w:r>
-        <w:t xml:space="preserve"> </w:t>
-      </w:r>
-      <w:r>
-        <w:t xml:space="preserve">|M. 4.7|Deepfakes and Misinformation|Rini,</w:t>
-      </w:r>
-      <w:r>
-        <w:t xml:space="preserve"> </w:t>
-      </w:r>
-      <w:r>
-        <w:t xml:space="preserve">“</w:t>
-      </w:r>
-      <w:r>
-        <w:t xml:space="preserve">Deepfakes and the Epistemic Backstop</w:t>
-      </w:r>
-      <w:r>
-        <w:t xml:space="preserve">”</w:t>
-      </w:r>
-      <w:r>
-        <w:t xml:space="preserve">||</w:t>
-      </w:r>
-      <w:r>
-        <w:t xml:space="preserve"> </w:t>
-      </w:r>
-      <w:r>
-        <w:t xml:space="preserve">|W. 4.9|Algorithmic Bias|Fazelpour and Danks,</w:t>
-      </w:r>
-      <w:r>
-        <w:t xml:space="preserve"> </w:t>
-      </w:r>
-      <w:r>
-        <w:t xml:space="preserve">“</w:t>
-      </w:r>
-      <w:r>
-        <w:t xml:space="preserve">Algorithmic Bias</w:t>
-      </w:r>
-      <w:r>
-        <w:t xml:space="preserve">”</w:t>
-      </w:r>
-      <w:r>
-        <w:t xml:space="preserve">||</w:t>
-      </w:r>
-      <w:r>
-        <w:br/>
-      </w:r>
-      <w:r>
-        <w:t xml:space="preserve">|M. 4.14|Epistemic Injustice and AI|Kay, et al. </w:t>
-      </w:r>
-      <w:r>
-        <w:t xml:space="preserve">“</w:t>
-      </w:r>
-      <w:r>
-        <w:t xml:space="preserve">Epistemic Injustice in Generative AI</w:t>
-      </w:r>
-      <w:r>
-        <w:t xml:space="preserve">”</w:t>
-      </w:r>
-      <w:r>
-        <w:t xml:space="preserve">||</w:t>
-      </w:r>
-      <w:r>
-        <w:br/>
-      </w:r>
-      <w:r>
-        <w:t xml:space="preserve">|W. 4.16|Group Presentation||Research Paper Draft|</w:t>
-      </w:r>
-      <w:r>
-        <w:t xml:space="preserve"> </w:t>
-      </w:r>
-      <w:r>
-        <w:t xml:space="preserve">|M. 4.21|Group Presentation|||</w:t>
-      </w:r>
-      <w:r>
-        <w:br/>
-      </w:r>
-      <w:r>
-        <w:t xml:space="preserve">|W. 4.22|Group Presentation|||</w:t>
-      </w:r>
-      <w:r>
-        <w:br/>
-      </w:r>
-      <w:r>
-        <w:t xml:space="preserve">|M. 4.28|Group Presentation|||</w:t>
-      </w:r>
-      <w:r>
-        <w:br/>
-      </w:r>
-      <w:r>
-        <w:t xml:space="preserve">|W. 4.30|Wrapping Up|||</w:t>
-      </w:r>
-    </w:p>
-    <w:bookmarkEnd w:id="39"/>
     <w:sectPr/>
   </w:body>
 </w:document>

</xml_diff>